<commit_message>
judgment fields and issues
</commit_message>
<xml_diff>
--- a/docassemble/MODivorceForms/data/templates/mo_divorce_forms_next_steps.docx
+++ b/docassemble/MODivorceForms/data/templates/mo_divorce_forms_next_steps.docx
@@ -1191,7 +1191,13 @@
               <w:t>p</w:t>
             </w:r>
             <w:r>
-              <w:t xml:space="preserve"> for doc in doc_list.true_values() %}</w:t>
+              <w:t xml:space="preserve"> for doc in doc_list</w:t>
+            </w:r>
+            <w:r>
+              <w:t>_selected</w:t>
+            </w:r>
+            <w:r>
+              <w:t>.true_values() %}</w:t>
             </w:r>
           </w:p>
           <w:p>
@@ -1739,7 +1745,34 @@
           <w:sz w:val="36"/>
           <w14:ligatures w14:val="none"/>
         </w:rPr>
-        <w:t>{%p if case.filed in ["not_filed"] %}</w:t>
+        <w:t>{%p if case.filed in ["not_filed"</w:t>
+      </w:r>
+      <w:r>
+        <w:rPr>
+          <w:rFonts w:ascii="Tenorite" w:eastAsia="Times New Roman" w:hAnsi="Tenorite" w:cs="Times New Roman"/>
+          <w:kern w:val="0"/>
+          <w:sz w:val="36"/>
+          <w14:ligatures w14:val="none"/>
+        </w:rPr>
+        <w:t>,</w:t>
+      </w:r>
+      <w:r>
+        <w:rPr>
+          <w:rFonts w:ascii="Tenorite" w:eastAsia="Times New Roman" w:hAnsi="Tenorite" w:cs="Times New Roman"/>
+          <w:kern w:val="0"/>
+          <w:sz w:val="36"/>
+          <w14:ligatures w14:val="none"/>
+        </w:rPr>
+        <w:t>"user0_filed"</w:t>
+      </w:r>
+      <w:r>
+        <w:rPr>
+          <w:rFonts w:ascii="Tenorite" w:eastAsia="Times New Roman" w:hAnsi="Tenorite" w:cs="Times New Roman"/>
+          <w:kern w:val="0"/>
+          <w:sz w:val="36"/>
+          <w14:ligatures w14:val="none"/>
+        </w:rPr>
+        <w:t>] %}</w:t>
       </w:r>
     </w:p>
     <w:p>

</xml_diff>

<commit_message>
made table of contents conditional and fixed page break problems
</commit_message>
<xml_diff>
--- a/docassemble/MODivorceForms/data/templates/mo_divorce_forms_next_steps.docx
+++ b/docassemble/MODivorceForms/data/templates/mo_divorce_forms_next_steps.docx
@@ -253,25 +253,6 @@
           </w:cols>
           <w:docGrid w:linePitch="299"/>
         </w:sectPr>
-      </w:pPr>
-    </w:p>
-    <w:p>
-      <w:pPr>
-        <w:spacing w:after="819" w:line="240" w:lineRule="auto"/>
-        <w:ind w:left="4602"/>
-        <w:contextualSpacing/>
-        <w:rPr>
-          <w:i/>
-          <w:color w:val="775F55"/>
-          <w:sz w:val="20"/>
-        </w:rPr>
-      </w:pPr>
-    </w:p>
-    <w:p>
-      <w:pPr>
-        <w:spacing w:after="819" w:line="240" w:lineRule="auto"/>
-        <w:ind w:left="5322" w:firstLine="438"/>
-        <w:contextualSpacing/>
       </w:pPr>
     </w:p>
     <w:p>
@@ -684,6 +665,13 @@
         <w:ind w:left="1026"/>
       </w:pPr>
       <w:r>
+        <w:rPr>
+          <w:rFonts w:ascii="Times New Roman" w:hAnsi="Times New Roman" w:cs="Times New Roman"/>
+          <w:szCs w:val="22"/>
+        </w:rPr>
+        <w:t>{% if case.filed in ["not_filed","user0_filed"] %}</w:t>
+      </w:r>
+      <w:r>
         <w:t>Service</w:t>
       </w:r>
     </w:p>
@@ -811,6 +799,27 @@
         <w:ind w:left="1026"/>
       </w:pPr>
       <w:r>
+        <w:rPr>
+          <w:rFonts w:ascii="Times New Roman" w:hAnsi="Times New Roman" w:cs="Times New Roman"/>
+          <w:szCs w:val="22"/>
+        </w:rPr>
+        <w:t xml:space="preserve">{% </w:t>
+      </w:r>
+      <w:r>
+        <w:rPr>
+          <w:rFonts w:ascii="Times New Roman" w:hAnsi="Times New Roman" w:cs="Times New Roman"/>
+          <w:szCs w:val="22"/>
+        </w:rPr>
+        <w:t>end</w:t>
+      </w:r>
+      <w:r>
+        <w:rPr>
+          <w:rFonts w:ascii="Times New Roman" w:hAnsi="Times New Roman" w:cs="Times New Roman"/>
+          <w:szCs w:val="22"/>
+        </w:rPr>
+        <w:t>if %}</w:t>
+      </w:r>
+      <w:r>
         <w:t>Your Final Hearing</w:t>
       </w:r>
     </w:p>
@@ -936,12 +945,29 @@
       <w:pPr>
         <w:spacing w:after="0" w:line="265" w:lineRule="auto"/>
         <w:ind w:left="1026" w:hanging="10"/>
-      </w:pPr>
-      <w:r>
         <w:rPr>
           <w:sz w:val="36"/>
         </w:rPr>
+      </w:pPr>
+      <w:r>
+        <w:rPr>
+          <w:sz w:val="36"/>
+        </w:rPr>
         <w:t>After Your Hearing</w:t>
+      </w:r>
+    </w:p>
+    <w:p>
+      <w:pPr>
+        <w:spacing w:line="278" w:lineRule="auto"/>
+        <w:rPr>
+          <w:sz w:val="36"/>
+        </w:rPr>
+      </w:pPr>
+      <w:r>
+        <w:rPr>
+          <w:sz w:val="36"/>
+        </w:rPr>
+        <w:br w:type="page"/>
       </w:r>
     </w:p>
     <w:p>
@@ -954,19 +980,9 @@
           <w:color w:val="898989"/>
           <w:sz w:val="10"/>
         </w:rPr>
+        <w:lastRenderedPageBreak/>
         <w:t>2</w:t>
       </w:r>
-    </w:p>
-    <w:p>
-      <w:pPr>
-        <w:pStyle w:val="Heading2"/>
-        <w:spacing w:after="43"/>
-        <w:ind w:left="0"/>
-        <w:rPr>
-          <w:sz w:val="22"/>
-          <w:szCs w:val="22"/>
-        </w:rPr>
-      </w:pPr>
     </w:p>
     <w:p>
       <w:pPr>
@@ -3516,12 +3532,17 @@
           <w:szCs w:val="22"/>
         </w:rPr>
       </w:pPr>
-    </w:p>
-    <w:p>
-      <w:pPr>
-        <w:pStyle w:val="ListParagraph"/>
-        <w:spacing w:after="0" w:line="240" w:lineRule="auto"/>
-        <w:ind w:left="1249"/>
+      <w:r>
+        <w:rPr>
+          <w:rFonts w:ascii="Times New Roman" w:hAnsi="Times New Roman" w:cs="Times New Roman"/>
+          <w:szCs w:val="22"/>
+        </w:rPr>
+        <w:t>{% endif %}</w:t>
+      </w:r>
+    </w:p>
+    <w:p>
+      <w:pPr>
+        <w:spacing w:line="278" w:lineRule="auto"/>
         <w:rPr>
           <w:rFonts w:ascii="Times New Roman" w:hAnsi="Times New Roman" w:cs="Times New Roman"/>
           <w:szCs w:val="22"/>
@@ -3533,6 +3554,13 @@
           <w:cols w:num="2" w:space="720"/>
         </w:sectPr>
       </w:pPr>
+      <w:r>
+        <w:rPr>
+          <w:rFonts w:ascii="Times New Roman" w:hAnsi="Times New Roman" w:cs="Times New Roman"/>
+          <w:szCs w:val="22"/>
+        </w:rPr>
+        <w:br w:type="page"/>
+      </w:r>
     </w:p>
     <w:p>
       <w:pPr>
@@ -3549,33 +3577,13 @@
       </w:pPr>
       <w:r>
         <w:rPr>
-          <w:rFonts w:ascii="Times New Roman" w:hAnsi="Times New Roman" w:cs="Times New Roman"/>
-          <w:szCs w:val="22"/>
-        </w:rPr>
-        <w:t xml:space="preserve">{% </w:t>
-      </w:r>
-      <w:r>
-        <w:rPr>
-          <w:rFonts w:ascii="Times New Roman" w:hAnsi="Times New Roman" w:cs="Times New Roman"/>
-          <w:szCs w:val="22"/>
-        </w:rPr>
-        <w:t>endif</w:t>
-      </w:r>
-      <w:r>
-        <w:rPr>
-          <w:rFonts w:ascii="Times New Roman" w:hAnsi="Times New Roman" w:cs="Times New Roman"/>
-          <w:szCs w:val="22"/>
-        </w:rPr>
-        <w:t xml:space="preserve"> %}</w:t>
-      </w:r>
-      <w:r>
-        <w:rPr>
           <w:b/>
           <w:bCs/>
           <w:color w:val="FFFFFF" w:themeColor="background1"/>
           <w:sz w:val="48"/>
           <w:szCs w:val="48"/>
         </w:rPr>
+        <w:lastRenderedPageBreak/>
         <w:t>YOUR FINAL HEARING</w:t>
       </w:r>
     </w:p>
@@ -4661,7 +4669,6 @@
           <w:sz w:val="24"/>
           <w14:ligatures w14:val="none"/>
         </w:rPr>
-        <w:lastRenderedPageBreak/>
         <w:t>If not, be ready to explain what you think is fair and why.</w:t>
       </w:r>
       <w:r>
@@ -5803,21 +5810,6 @@
         </w:rPr>
         <w:t xml:space="preserve"> under limited scope representation.</w:t>
       </w:r>
-    </w:p>
-    <w:p>
-      <w:pPr>
-        <w:tabs>
-          <w:tab w:val="left" w:pos="1650"/>
-        </w:tabs>
-        <w:spacing w:line="278" w:lineRule="auto"/>
-        <w:rPr>
-          <w:rFonts w:ascii="Times New Roman" w:hAnsi="Times New Roman" w:cs="Times New Roman"/>
-          <w:b/>
-          <w:bCs/>
-          <w:color w:val="FFFFFF" w:themeColor="background1"/>
-          <w:sz w:val="24"/>
-        </w:rPr>
-      </w:pPr>
     </w:p>
     <w:sectPr>
       <w:type w:val="continuous"/>
@@ -13881,6 +13873,15 @@
 </file>
 
 <file path=customXml/item1.xml><?xml version="1.0" encoding="utf-8"?>
+<?mso-contentType ?>
+<FormTemplates xmlns="http://schemas.microsoft.com/sharepoint/v3/contenttype/forms">
+  <Display>DocumentLibraryForm</Display>
+  <Edit>DocumentLibraryForm</Edit>
+  <New>DocumentLibraryForm</New>
+</FormTemplates>
+</file>
+
+<file path=customXml/item2.xml><?xml version="1.0" encoding="utf-8"?>
 <ct:contentTypeSchema xmlns:ct="http://schemas.microsoft.com/office/2006/metadata/contentType" xmlns:ma="http://schemas.microsoft.com/office/2006/metadata/properties/metaAttributes" ct:_="" ma:_="" ma:contentTypeName="Document" ma:contentTypeID="0x010100CE74CCE3EA761F4FB2ECE05E6740826C" ma:contentTypeVersion="22" ma:contentTypeDescription="Create a new document." ma:contentTypeScope="" ma:versionID="363bdbde3249c2d1c8187603616d51bf">
   <xsd:schema xmlns:xsd="http://www.w3.org/2001/XMLSchema" xmlns:xs="http://www.w3.org/2001/XMLSchema" xmlns:p="http://schemas.microsoft.com/office/2006/metadata/properties" xmlns:ns1="http://schemas.microsoft.com/sharepoint/v3" xmlns:ns2="877cd569-5afe-4c79-a79c-fefa2579d9de" xmlns:ns3="78e338ca-bdc9-4d5d-85ca-e5d51d206c55" targetNamespace="http://schemas.microsoft.com/office/2006/metadata/properties" ma:root="true" ma:fieldsID="ecc2c3765018bb73925974a56d08b4bc" ns1:_="" ns2:_="" ns3:_="">
     <xsd:import namespace="http://schemas.microsoft.com/sharepoint/v3"/>
@@ -14152,15 +14153,6 @@
 </ct:contentTypeSchema>
 </file>
 
-<file path=customXml/item2.xml><?xml version="1.0" encoding="utf-8"?>
-<?mso-contentType ?>
-<FormTemplates xmlns="http://schemas.microsoft.com/sharepoint/v3/contenttype/forms">
-  <Display>DocumentLibraryForm</Display>
-  <Edit>DocumentLibraryForm</Edit>
-  <New>DocumentLibraryForm</New>
-</FormTemplates>
-</file>
-
 <file path=customXml/item3.xml><?xml version="1.0" encoding="utf-8"?>
 <p:properties xmlns:p="http://schemas.microsoft.com/office/2006/metadata/properties" xmlns:xsi="http://www.w3.org/2001/XMLSchema-instance" xmlns:pc="http://schemas.microsoft.com/office/infopath/2007/PartnerControls">
   <documentManagement>
@@ -14175,6 +14167,14 @@
 </file>
 
 <file path=customXml/itemProps1.xml><?xml version="1.0" encoding="utf-8"?>
+<ds:datastoreItem xmlns:ds="http://schemas.openxmlformats.org/officeDocument/2006/customXml" ds:itemID="{ADFF9132-AF90-4B64-AF84-E8F70AF7AC23}">
+  <ds:schemaRefs>
+    <ds:schemaRef ds:uri="http://schemas.microsoft.com/sharepoint/v3/contenttype/forms"/>
+  </ds:schemaRefs>
+</ds:datastoreItem>
+</file>
+
+<file path=customXml/itemProps2.xml><?xml version="1.0" encoding="utf-8"?>
 <ds:datastoreItem xmlns:ds="http://schemas.openxmlformats.org/officeDocument/2006/customXml" ds:itemID="{C5C1D37F-25C3-4149-8600-2F9CC450D14D}">
   <ds:schemaRefs>
     <ds:schemaRef ds:uri="http://schemas.microsoft.com/office/2006/metadata/contentType"/>
@@ -14194,14 +14194,6 @@
 </ds:datastoreItem>
 </file>
 
-<file path=customXml/itemProps2.xml><?xml version="1.0" encoding="utf-8"?>
-<ds:datastoreItem xmlns:ds="http://schemas.openxmlformats.org/officeDocument/2006/customXml" ds:itemID="{ADFF9132-AF90-4B64-AF84-E8F70AF7AC23}">
-  <ds:schemaRefs>
-    <ds:schemaRef ds:uri="http://schemas.microsoft.com/sharepoint/v3/contenttype/forms"/>
-  </ds:schemaRefs>
-</ds:datastoreItem>
-</file>
-
 <file path=customXml/itemProps3.xml><?xml version="1.0" encoding="utf-8"?>
 <ds:datastoreItem xmlns:ds="http://schemas.openxmlformats.org/officeDocument/2006/customXml" ds:itemID="{02F8C0C0-DB00-4F6A-A541-13479DDE7D69}">
   <ds:schemaRefs>

</xml_diff>